<commit_message>
bug fixes and enhancements
</commit_message>
<xml_diff>
--- a/examples/demo.docx
+++ b/examples/demo.docx
@@ -9,8 +9,8 @@
       <w:bookmarkStart w:id="0" w:name="top"/>
       <w:r>
         <w:rPr>
-          <w:sz w:val="21"/>
-          <w:szCs w:val="21"/>
+          <w:sz w:val="29"/>
+          <w:szCs w:val="29"/>
           <w:lang w:val="en"/>
         </w:rPr>
         <w:t>Typst to DOCX demonstration</w:t>
@@ -19,8 +19,8 @@
     </w:p>
     <w:p>
       <w:pPr>
+        <w:spacing w:line="403" w:lineRule="auto"/>
         <w:jc w:val="both"/>
-        <w:spacing w:line="403" w:lineRule="auto"/>
       </w:pPr>
       <w:r>
         <w:rPr>
@@ -66,9 +66,9 @@
       </w:r>
       <w:r>
         <w:rPr>
+          <w:sz w:val="21"/>
+          <w:szCs w:val="21"/>
           <w:u w:val="single"/>
-          <w:sz w:val="21"/>
-          <w:szCs w:val="21"/>
           <w:lang w:val="en"/>
         </w:rPr>
         <w:t>underlined</w:t>
@@ -190,8 +190,8 @@
       </w:pPr>
       <w:r>
         <w:rPr>
-          <w:sz w:val="21"/>
-          <w:szCs w:val="21"/>
+          <w:sz w:val="25"/>
+          <w:szCs w:val="25"/>
           <w:lang w:val="en"/>
         </w:rPr>
         <w:t>Lists</w:t>
@@ -204,8 +204,8 @@
           <w:ilvl w:val="0"/>
           <w:numId w:val="1"/>
         </w:numPr>
+        <w:spacing w:line="403" w:lineRule="auto"/>
         <w:jc w:val="both"/>
-        <w:spacing w:line="403" w:lineRule="auto"/>
       </w:pPr>
       <w:r>
         <w:rPr>
@@ -223,8 +223,8 @@
           <w:ilvl w:val="0"/>
           <w:numId w:val="1"/>
         </w:numPr>
+        <w:spacing w:line="403" w:lineRule="auto"/>
         <w:jc w:val="both"/>
-        <w:spacing w:line="403" w:lineRule="auto"/>
       </w:pPr>
       <w:r>
         <w:rPr>
@@ -242,8 +242,8 @@
           <w:ilvl w:val="1"/>
           <w:numId w:val="2"/>
         </w:numPr>
+        <w:spacing w:line="403" w:lineRule="auto"/>
         <w:jc w:val="both"/>
-        <w:spacing w:line="403" w:lineRule="auto"/>
       </w:pPr>
       <w:r>
         <w:rPr>
@@ -261,8 +261,8 @@
           <w:ilvl w:val="0"/>
           <w:numId w:val="3"/>
         </w:numPr>
+        <w:spacing w:line="403" w:lineRule="auto"/>
         <w:jc w:val="both"/>
-        <w:spacing w:line="403" w:lineRule="auto"/>
       </w:pPr>
       <w:r>
         <w:rPr>
@@ -280,22 +280,22 @@
           <w:ilvl w:val="0"/>
           <w:numId w:val="3"/>
         </w:numPr>
+        <w:spacing w:line="403" w:lineRule="auto"/>
         <w:jc w:val="both"/>
+      </w:pPr>
+      <w:r>
+        <w:rPr>
+          <w:sz w:val="21"/>
+          <w:szCs w:val="21"/>
+          <w:lang w:val="en"/>
+        </w:rPr>
+        <w:t>Another numbered item</w:t>
+      </w:r>
+    </w:p>
+    <w:p>
+      <w:pPr>
         <w:spacing w:line="403" w:lineRule="auto"/>
-      </w:pPr>
-      <w:r>
-        <w:rPr>
-          <w:sz w:val="21"/>
-          <w:szCs w:val="21"/>
-          <w:lang w:val="en"/>
-        </w:rPr>
-        <w:t>Another numbered item</w:t>
-      </w:r>
-    </w:p>
-    <w:p>
-      <w:pPr>
         <w:jc w:val="both"/>
-        <w:spacing w:line="403" w:lineRule="auto"/>
       </w:pPr>
       <w:r>
         <w:rPr>
@@ -324,8 +324,8 @@
       </w:pPr>
       <w:r>
         <w:rPr>
-          <w:sz w:val="21"/>
-          <w:szCs w:val="21"/>
+          <w:sz w:val="25"/>
+          <w:szCs w:val="25"/>
           <w:lang w:val="en"/>
         </w:rPr>
         <w:t>Quote and code</w:t>
@@ -334,8 +334,8 @@
     <w:p>
       <w:pPr>
         <w:pStyle w:val="Quote"/>
+        <w:spacing w:before="528" w:after="0" w:line="403" w:lineRule="auto"/>
         <w:jc w:val="both"/>
-        <w:spacing w:line="403" w:lineRule="auto"/>
       </w:pPr>
       <w:r>
         <w:rPr>
@@ -349,6 +349,7 @@
     <w:p>
       <w:pPr>
         <w:pStyle w:val="Quote"/>
+        <w:spacing w:before="0" w:after="396"/>
         <w:jc w:val="right"/>
       </w:pPr>
       <w:r>
@@ -366,14 +367,15 @@
     <w:p>
       <w:pPr>
         <w:pStyle w:val="Code"/>
-        <w:shd w:val="clear" w:color="auto" w:fill="F2F2F2"/>
-      </w:pPr>
-      <w:r>
-        <w:rPr>
+      </w:pPr>
+      <w:r>
+        <w:rPr>
+          <w:rFonts w:ascii="DejaVu Sans Mono" w:hAnsi="DejaVu Sans Mono"/>
           <w:noProof w:val="1"/>
-          <w:rFonts w:ascii="Courier New" w:hAnsi="Courier New"/>
-          <w:sz w:val="18"/>
-          <w:szCs w:val="18"/>
+          <w:color w:val="000000"/>
+          <w:sz w:val="17"/>
+          <w:szCs w:val="17"/>
+          <w:lang w:val="en"/>
         </w:rPr>
         <w:t>values = [1, 2, 3]</w:t>
       </w:r>
@@ -382,10 +384,12 @@
       </w:r>
       <w:r>
         <w:rPr>
+          <w:rFonts w:ascii="DejaVu Sans Mono" w:hAnsi="DejaVu Sans Mono"/>
           <w:noProof w:val="1"/>
-          <w:rFonts w:ascii="Courier New" w:hAnsi="Courier New"/>
-          <w:sz w:val="18"/>
-          <w:szCs w:val="18"/>
+          <w:color w:val="000000"/>
+          <w:sz w:val="17"/>
+          <w:szCs w:val="17"/>
+          <w:lang w:val="en"/>
         </w:rPr>
         <w:t>print(sum(values))</w:t>
       </w:r>
@@ -396,8 +400,8 @@
       </w:pPr>
       <w:r>
         <w:rPr>
-          <w:sz w:val="21"/>
-          <w:szCs w:val="21"/>
+          <w:sz w:val="25"/>
+          <w:szCs w:val="25"/>
           <w:lang w:val="en"/>
         </w:rPr>
         <w:t>Equation</w:t>
@@ -455,13 +459,18 @@
       </m:oMathPara>
     </w:p>
     <w:p>
+      <w:r>
+        <w:br w:type="page"/>
+      </w:r>
+    </w:p>
+    <w:p>
       <w:pPr>
         <w:pStyle w:val="Heading2"/>
       </w:pPr>
       <w:r>
         <w:rPr>
-          <w:sz w:val="21"/>
-          <w:szCs w:val="21"/>
+          <w:sz w:val="25"/>
+          <w:szCs w:val="25"/>
           <w:lang w:val="en"/>
         </w:rPr>
         <w:t>Table</w:t>
@@ -472,12 +481,12 @@
         <w:tblW w:w="0" w:type="auto"/>
         <w:tblLayout w:type="fixed"/>
         <w:tblBorders>
-          <w:top w:val="single" w:sz="4" w:space="0" w:color="BFBFBF"/>
-          <w:left w:val="single" w:sz="4" w:space="0" w:color="BFBFBF"/>
-          <w:bottom w:val="single" w:sz="4" w:space="0" w:color="BFBFBF"/>
-          <w:right w:val="single" w:sz="4" w:space="0" w:color="BFBFBF"/>
-          <w:insideH w:val="single" w:sz="4" w:space="0" w:color="BFBFBF"/>
-          <w:insideV w:val="single" w:sz="4" w:space="0" w:color="BFBFBF"/>
+          <w:top w:val="single" w:sz="8" w:space="0" w:color="000000"/>
+          <w:left w:val="single" w:sz="8" w:space="0" w:color="000000"/>
+          <w:bottom w:val="single" w:sz="8" w:space="0" w:color="000000"/>
+          <w:right w:val="single" w:sz="8" w:space="0" w:color="000000"/>
+          <w:insideH w:val="single" w:sz="8" w:space="0" w:color="000000"/>
+          <w:insideV w:val="single" w:sz="8" w:space="0" w:color="000000"/>
         </w:tblBorders>
       </w:tblPr>
       <w:tblGrid>
@@ -492,12 +501,18 @@
         <w:tc>
           <w:tcPr>
             <w:tcW w:w="1440" w:type="dxa"/>
+            <w:tcMar>
+              <w:top w:w="100" w:type="dxa"/>
+              <w:left w:w="100" w:type="dxa"/>
+              <w:bottom w:w="100" w:type="dxa"/>
+              <w:right w:w="100" w:type="dxa"/>
+            </w:tcMar>
             <w:tcFitText w:val="0"/>
           </w:tcPr>
           <w:p>
             <w:pPr>
+              <w:spacing w:line="403" w:lineRule="auto"/>
               <w:jc w:val="both"/>
-              <w:spacing w:line="403" w:lineRule="auto"/>
             </w:pPr>
             <w:r>
               <w:rPr>
@@ -512,12 +527,18 @@
         <w:tc>
           <w:tcPr>
             <w:tcW w:w="1440" w:type="dxa"/>
+            <w:tcMar>
+              <w:top w:w="100" w:type="dxa"/>
+              <w:left w:w="100" w:type="dxa"/>
+              <w:bottom w:w="100" w:type="dxa"/>
+              <w:right w:w="100" w:type="dxa"/>
+            </w:tcMar>
             <w:tcFitText w:val="0"/>
           </w:tcPr>
           <w:p>
             <w:pPr>
+              <w:spacing w:line="403" w:lineRule="auto"/>
               <w:jc w:val="both"/>
-              <w:spacing w:line="403" w:lineRule="auto"/>
             </w:pPr>
             <w:r>
               <w:rPr>
@@ -532,12 +553,18 @@
         <w:tc>
           <w:tcPr>
             <w:tcW w:w="1440" w:type="dxa"/>
+            <w:tcMar>
+              <w:top w:w="100" w:type="dxa"/>
+              <w:left w:w="100" w:type="dxa"/>
+              <w:bottom w:w="100" w:type="dxa"/>
+              <w:right w:w="100" w:type="dxa"/>
+            </w:tcMar>
             <w:tcFitText w:val="0"/>
           </w:tcPr>
           <w:p>
             <w:pPr>
+              <w:spacing w:line="403" w:lineRule="auto"/>
               <w:jc w:val="both"/>
-              <w:spacing w:line="403" w:lineRule="auto"/>
             </w:pPr>
             <w:r>
               <w:rPr>
@@ -554,11 +581,17 @@
         <w:tc>
           <w:tcPr>
             <w:tcW w:w="1440" w:type="dxa"/>
+            <w:tcMar>
+              <w:top w:w="100" w:type="dxa"/>
+              <w:left w:w="100" w:type="dxa"/>
+              <w:bottom w:w="100" w:type="dxa"/>
+              <w:right w:w="100" w:type="dxa"/>
+            </w:tcMar>
           </w:tcPr>
           <w:p>
             <w:pPr>
+              <w:spacing w:line="403" w:lineRule="auto"/>
               <w:jc w:val="both"/>
-              <w:spacing w:line="403" w:lineRule="auto"/>
             </w:pPr>
             <w:r>
               <w:rPr>
@@ -573,17 +606,23 @@
         <w:tc>
           <w:tcPr>
             <w:tcW w:w="1440" w:type="dxa"/>
+            <w:tcMar>
+              <w:top w:w="100" w:type="dxa"/>
+              <w:left w:w="100" w:type="dxa"/>
+              <w:bottom w:w="100" w:type="dxa"/>
+              <w:right w:w="100" w:type="dxa"/>
+            </w:tcMar>
           </w:tcPr>
           <w:p>
             <w:pPr>
+              <w:spacing w:line="403" w:lineRule="auto"/>
               <w:jc w:val="both"/>
-              <w:spacing w:line="403" w:lineRule="auto"/>
             </w:pPr>
             <w:r>
               <w:rPr>
-                <w:rFonts w:ascii="Consolas" w:hAnsi="Consolas"/>
-                <w:sz w:val="21"/>
-                <w:szCs w:val="21"/>
+                <w:rFonts w:ascii="DejaVu Sans Mono" w:hAnsi="DejaVu Sans Mono"/>
+                <w:sz w:val="17"/>
+                <w:szCs w:val="17"/>
                 <w:lang w:val="en"/>
               </w:rPr>
               <w:t>= syntax</w:t>
@@ -593,11 +632,17 @@
         <w:tc>
           <w:tcPr>
             <w:tcW w:w="1440" w:type="dxa"/>
+            <w:tcMar>
+              <w:top w:w="100" w:type="dxa"/>
+              <w:left w:w="100" w:type="dxa"/>
+              <w:bottom w:w="100" w:type="dxa"/>
+              <w:right w:w="100" w:type="dxa"/>
+            </w:tcMar>
           </w:tcPr>
           <w:p>
             <w:pPr>
+              <w:spacing w:line="403" w:lineRule="auto"/>
               <w:jc w:val="both"/>
-              <w:spacing w:line="403" w:lineRule="auto"/>
             </w:pPr>
             <w:r>
               <w:rPr>
@@ -614,11 +659,17 @@
         <w:tc>
           <w:tcPr>
             <w:tcW w:w="1440" w:type="dxa"/>
+            <w:tcMar>
+              <w:top w:w="100" w:type="dxa"/>
+              <w:left w:w="100" w:type="dxa"/>
+              <w:bottom w:w="100" w:type="dxa"/>
+              <w:right w:w="100" w:type="dxa"/>
+            </w:tcMar>
           </w:tcPr>
           <w:p>
             <w:pPr>
+              <w:spacing w:line="403" w:lineRule="auto"/>
               <w:jc w:val="both"/>
-              <w:spacing w:line="403" w:lineRule="auto"/>
             </w:pPr>
             <w:r>
               <w:rPr>
@@ -633,11 +684,17 @@
         <w:tc>
           <w:tcPr>
             <w:tcW w:w="1440" w:type="dxa"/>
+            <w:tcMar>
+              <w:top w:w="100" w:type="dxa"/>
+              <w:left w:w="100" w:type="dxa"/>
+              <w:bottom w:w="100" w:type="dxa"/>
+              <w:right w:w="100" w:type="dxa"/>
+            </w:tcMar>
           </w:tcPr>
           <w:p>
             <w:pPr>
+              <w:spacing w:line="403" w:lineRule="auto"/>
               <w:jc w:val="both"/>
-              <w:spacing w:line="403" w:lineRule="auto"/>
             </w:pPr>
             <m:oMath>
               <m:f>
@@ -658,11 +715,17 @@
         <w:tc>
           <w:tcPr>
             <w:tcW w:w="1440" w:type="dxa"/>
+            <w:tcMar>
+              <w:top w:w="100" w:type="dxa"/>
+              <w:left w:w="100" w:type="dxa"/>
+              <w:bottom w:w="100" w:type="dxa"/>
+              <w:right w:w="100" w:type="dxa"/>
+            </w:tcMar>
           </w:tcPr>
           <w:p>
             <w:pPr>
+              <w:spacing w:line="403" w:lineRule="auto"/>
               <w:jc w:val="both"/>
-              <w:spacing w:line="403" w:lineRule="auto"/>
             </w:pPr>
             <w:r>
               <w:rPr>
@@ -679,11 +742,17 @@
         <w:tc>
           <w:tcPr>
             <w:tcW w:w="1440" w:type="dxa"/>
+            <w:tcMar>
+              <w:top w:w="100" w:type="dxa"/>
+              <w:left w:w="100" w:type="dxa"/>
+              <w:bottom w:w="100" w:type="dxa"/>
+              <w:right w:w="100" w:type="dxa"/>
+            </w:tcMar>
           </w:tcPr>
           <w:p>
             <w:pPr>
+              <w:spacing w:line="403" w:lineRule="auto"/>
               <w:jc w:val="both"/>
-              <w:spacing w:line="403" w:lineRule="auto"/>
             </w:pPr>
             <w:r>
               <w:rPr>
@@ -698,17 +767,23 @@
         <w:tc>
           <w:tcPr>
             <w:tcW w:w="1440" w:type="dxa"/>
+            <w:tcMar>
+              <w:top w:w="100" w:type="dxa"/>
+              <w:left w:w="100" w:type="dxa"/>
+              <w:bottom w:w="100" w:type="dxa"/>
+              <w:right w:w="100" w:type="dxa"/>
+            </w:tcMar>
           </w:tcPr>
           <w:p>
             <w:pPr>
+              <w:spacing w:line="403" w:lineRule="auto"/>
               <w:jc w:val="both"/>
-              <w:spacing w:line="403" w:lineRule="auto"/>
             </w:pPr>
             <w:r>
               <w:rPr>
-                <w:rFonts w:ascii="Consolas" w:hAnsi="Consolas"/>
-                <w:sz w:val="21"/>
-                <w:szCs w:val="21"/>
+                <w:rFonts w:ascii="DejaVu Sans Mono" w:hAnsi="DejaVu Sans Mono"/>
+                <w:sz w:val="17"/>
+                <w:szCs w:val="17"/>
                 <w:lang w:val="en"/>
               </w:rPr>
               <w:t>#table(...)</w:t>
@@ -718,17 +793,23 @@
         <w:tc>
           <w:tcPr>
             <w:tcW w:w="1440" w:type="dxa"/>
+            <w:tcMar>
+              <w:top w:w="100" w:type="dxa"/>
+              <w:left w:w="100" w:type="dxa"/>
+              <w:bottom w:w="100" w:type="dxa"/>
+              <w:right w:w="100" w:type="dxa"/>
+            </w:tcMar>
           </w:tcPr>
           <w:p>
             <w:pPr>
+              <w:spacing w:line="403" w:lineRule="auto"/>
               <w:jc w:val="both"/>
-              <w:spacing w:line="403" w:lineRule="auto"/>
             </w:pPr>
             <w:r>
               <w:rPr>
-                <w:rFonts w:ascii="Consolas" w:hAnsi="Consolas"/>
-                <w:sz w:val="21"/>
-                <w:szCs w:val="21"/>
+                <w:rFonts w:ascii="DejaVu Sans Mono" w:hAnsi="DejaVu Sans Mono"/>
+                <w:sz w:val="17"/>
+                <w:szCs w:val="17"/>
                 <w:lang w:val="en"/>
               </w:rPr>
               <w:t>w:tbl</w:t>
@@ -738,18 +819,13 @@
       </w:tr>
     </w:tbl>
     <w:p>
-      <w:r>
-        <w:br w:type="page"/>
-      </w:r>
-    </w:p>
-    <w:p>
       <w:pPr>
         <w:pStyle w:val="Heading2"/>
       </w:pPr>
       <w:r>
         <w:rPr>
-          <w:sz w:val="21"/>
-          <w:szCs w:val="21"/>
+          <w:sz w:val="25"/>
+          <w:szCs w:val="25"/>
           <w:lang w:val="en"/>
         </w:rPr>
         <w:t>Second page</w:t>
@@ -757,8 +833,8 @@
     </w:p>
     <w:p>
       <w:pPr>
+        <w:spacing w:line="403" w:lineRule="auto"/>
         <w:jc w:val="both"/>
-        <w:spacing w:line="403" w:lineRule="auto"/>
       </w:pPr>
       <w:r>
         <w:rPr>
@@ -768,14 +844,14 @@
         </w:rPr>
         <w:t xml:space="preserve">Go back to </w:t>
       </w:r>
-      <w:hyperlink w:anchor="top_">
+      <w:hyperlink w:anchor="b__top_">
         <w:r>
           <w:rPr>
             <w:sz w:val="21"/>
             <w:szCs w:val="21"/>
             <w:lang w:val="en"/>
           </w:rPr>
-          <w:t>@top.</w:t>
+          <w:t>the beginning</w:t>
         </w:r>
       </w:hyperlink>
       <w:r>
@@ -784,13 +860,13 @@
           <w:szCs w:val="21"/>
           <w:lang w:val="en"/>
         </w:rPr>
-        <w:t xml:space="preserve"> The default </w:t>
-      </w:r>
-      <w:r>
-        <w:rPr>
-          <w:rFonts w:ascii="Consolas" w:hAnsi="Consolas"/>
-          <w:sz w:val="21"/>
-          <w:szCs w:val="21"/>
+        <w:t xml:space="preserve">. The default </w:t>
+      </w:r>
+      <w:r>
+        <w:rPr>
+          <w:rFonts w:ascii="DejaVu Sans Mono" w:hAnsi="DejaVu Sans Mono"/>
+          <w:sz w:val="17"/>
+          <w:szCs w:val="17"/>
           <w:lang w:val="en"/>
         </w:rPr>
         <w:t>auto</w:t>
@@ -806,8 +882,8 @@
     </w:p>
     <w:sectPr>
       <w:pgSz w:w="11906" w:h="16838"/>
-      <w:pgMar w:top="1247" w:right="1247" w:bottom="1247" w:left="1247" w:header="720" w:footer="720" w:gutter="0"/>
-      <w:cols w:num="1" w:space="720" w:equalWidth="1"/>
+      <w:pgMar w:top="1247" w:right="1247" w:bottom="1247" w:left="1247" w:header="992" w:footer="992" w:gutter="0"/>
+      <w:cols w:num="1" w:space="376" w:equalWidth="1"/>
     </w:sectPr>
   </w:body>
 </w:document>
@@ -832,9 +908,15 @@
   <w:footnote w:id="1">
     <w:p>
       <w:pPr>
+        <w:spacing w:line="403" w:lineRule="auto"/>
         <w:jc w:val="both"/>
-        <w:spacing w:line="403" w:lineRule="auto"/>
-      </w:pPr>
+      </w:pPr>
+      <w:r>
+        <w:footnoteRef/>
+      </w:r>
+      <w:r>
+        <w:t xml:space="preserve"> </w:t>
+      </w:r>
       <w:r>
         <w:rPr>
           <w:sz w:val="21"/>
@@ -856,117 +938,108 @@
       <w:start w:val="1"/>
       <w:numFmt w:val="bullet"/>
       <w:lvlText w:val="•"/>
-      <w:rPr>
-        <w:rFonts w:ascii="Symbol" w:hAnsi="Symbol"/>
-      </w:rPr>
-      <w:lvlJc w:val="left"/>
-      <w:pPr>
-        <w:tabs/>
-        <w:ind w:left="720" w:hanging="360"/>
+      <w:lvlJc w:val="left"/>
+      <w:pPr>
+        <w:tabs>
+          <w:tab w:val="num" w:pos="280"/>
+        </w:tabs>
+        <w:ind w:left="280" w:hanging="280"/>
       </w:pPr>
     </w:lvl>
     <w:lvl w:ilvl="1">
       <w:start w:val="1"/>
       <w:numFmt w:val="bullet"/>
       <w:lvlText w:val="◦"/>
-      <w:rPr>
-        <w:rFonts w:ascii="Symbol" w:hAnsi="Symbol"/>
-      </w:rPr>
-      <w:lvlJc w:val="left"/>
-      <w:pPr>
-        <w:tabs/>
-        <w:ind w:left="1080" w:hanging="360"/>
+      <w:lvlJc w:val="left"/>
+      <w:pPr>
+        <w:tabs>
+          <w:tab w:val="num" w:pos="560"/>
+        </w:tabs>
+        <w:ind w:left="560" w:hanging="280"/>
       </w:pPr>
     </w:lvl>
     <w:lvl w:ilvl="2">
       <w:start w:val="1"/>
       <w:numFmt w:val="bullet"/>
       <w:lvlText w:val="▪"/>
-      <w:rPr>
-        <w:rFonts w:ascii="Symbol" w:hAnsi="Symbol"/>
-      </w:rPr>
-      <w:lvlJc w:val="left"/>
-      <w:pPr>
-        <w:tabs/>
-        <w:ind w:left="1440" w:hanging="360"/>
+      <w:lvlJc w:val="left"/>
+      <w:pPr>
+        <w:tabs>
+          <w:tab w:val="num" w:pos="840"/>
+        </w:tabs>
+        <w:ind w:left="840" w:hanging="280"/>
       </w:pPr>
     </w:lvl>
     <w:lvl w:ilvl="3">
       <w:start w:val="1"/>
       <w:numFmt w:val="bullet"/>
       <w:lvlText w:val="•"/>
-      <w:rPr>
-        <w:rFonts w:ascii="Symbol" w:hAnsi="Symbol"/>
-      </w:rPr>
-      <w:lvlJc w:val="left"/>
-      <w:pPr>
-        <w:tabs/>
-        <w:ind w:left="1800" w:hanging="360"/>
+      <w:lvlJc w:val="left"/>
+      <w:pPr>
+        <w:tabs>
+          <w:tab w:val="num" w:pos="1120"/>
+        </w:tabs>
+        <w:ind w:left="1120" w:hanging="280"/>
       </w:pPr>
     </w:lvl>
     <w:lvl w:ilvl="4">
       <w:start w:val="1"/>
       <w:numFmt w:val="bullet"/>
       <w:lvlText w:val="◦"/>
-      <w:rPr>
-        <w:rFonts w:ascii="Symbol" w:hAnsi="Symbol"/>
-      </w:rPr>
-      <w:lvlJc w:val="left"/>
-      <w:pPr>
-        <w:tabs/>
-        <w:ind w:left="2160" w:hanging="360"/>
+      <w:lvlJc w:val="left"/>
+      <w:pPr>
+        <w:tabs>
+          <w:tab w:val="num" w:pos="1400"/>
+        </w:tabs>
+        <w:ind w:left="1400" w:hanging="280"/>
       </w:pPr>
     </w:lvl>
     <w:lvl w:ilvl="5">
       <w:start w:val="1"/>
       <w:numFmt w:val="bullet"/>
       <w:lvlText w:val="▪"/>
-      <w:rPr>
-        <w:rFonts w:ascii="Symbol" w:hAnsi="Symbol"/>
-      </w:rPr>
-      <w:lvlJc w:val="left"/>
-      <w:pPr>
-        <w:tabs/>
-        <w:ind w:left="2520" w:hanging="360"/>
+      <w:lvlJc w:val="left"/>
+      <w:pPr>
+        <w:tabs>
+          <w:tab w:val="num" w:pos="1680"/>
+        </w:tabs>
+        <w:ind w:left="1680" w:hanging="280"/>
       </w:pPr>
     </w:lvl>
     <w:lvl w:ilvl="6">
       <w:start w:val="1"/>
       <w:numFmt w:val="bullet"/>
       <w:lvlText w:val="•"/>
-      <w:rPr>
-        <w:rFonts w:ascii="Symbol" w:hAnsi="Symbol"/>
-      </w:rPr>
-      <w:lvlJc w:val="left"/>
-      <w:pPr>
-        <w:tabs/>
-        <w:ind w:left="2880" w:hanging="360"/>
+      <w:lvlJc w:val="left"/>
+      <w:pPr>
+        <w:tabs>
+          <w:tab w:val="num" w:pos="1960"/>
+        </w:tabs>
+        <w:ind w:left="1960" w:hanging="280"/>
       </w:pPr>
     </w:lvl>
     <w:lvl w:ilvl="7">
       <w:start w:val="1"/>
       <w:numFmt w:val="bullet"/>
       <w:lvlText w:val="◦"/>
-      <w:rPr>
-        <w:rFonts w:ascii="Symbol" w:hAnsi="Symbol"/>
-      </w:rPr>
-      <w:lvlJc w:val="left"/>
-      <w:pPr>
-        <w:tabs/>
-        <w:ind w:left="3240" w:hanging="360"/>
+      <w:lvlJc w:val="left"/>
+      <w:pPr>
+        <w:tabs>
+          <w:tab w:val="num" w:pos="2240"/>
+        </w:tabs>
+        <w:ind w:left="2240" w:hanging="280"/>
       </w:pPr>
     </w:lvl>
     <w:lvl w:ilvl="8">
       <w:start w:val="1"/>
       <w:numFmt w:val="bullet"/>
       <w:lvlText w:val="▪"/>
-      <w:rPr>
-        <w:rFonts w:ascii="Symbol" w:hAnsi="Symbol"/>
-      </w:rPr>
-      <w:lvlJc w:val="left"/>
-      <w:pPr>
-        <w:tabs/>
-        <w:ind w:left="3600" w:hanging="360"/>
+      <w:lvlJc w:val="left"/>
+      <w:pPr>
+        <w:tabs>
+          <w:tab w:val="num" w:pos="2520"/>
+        </w:tabs>
+        <w:ind w:left="2520" w:hanging="280"/>
       </w:pPr>
     </w:lvl>
   </w:abstractNum>
@@ -979,117 +1052,108 @@
       <w:start w:val="1"/>
       <w:numFmt w:val="bullet"/>
       <w:lvlText w:val="•"/>
-      <w:rPr>
-        <w:rFonts w:ascii="Symbol" w:hAnsi="Symbol"/>
-      </w:rPr>
-      <w:lvlJc w:val="left"/>
-      <w:pPr>
-        <w:tabs/>
-        <w:ind w:left="720" w:hanging="360"/>
+      <w:lvlJc w:val="left"/>
+      <w:pPr>
+        <w:tabs>
+          <w:tab w:val="num" w:pos="280"/>
+        </w:tabs>
+        <w:ind w:left="280" w:hanging="280"/>
       </w:pPr>
     </w:lvl>
     <w:lvl w:ilvl="1">
       <w:start w:val="1"/>
       <w:numFmt w:val="bullet"/>
       <w:lvlText w:val="◦"/>
-      <w:rPr>
-        <w:rFonts w:ascii="Symbol" w:hAnsi="Symbol"/>
-      </w:rPr>
-      <w:lvlJc w:val="left"/>
-      <w:pPr>
-        <w:tabs/>
-        <w:ind w:left="1080" w:hanging="360"/>
+      <w:lvlJc w:val="left"/>
+      <w:pPr>
+        <w:tabs>
+          <w:tab w:val="num" w:pos="560"/>
+        </w:tabs>
+        <w:ind w:left="560" w:hanging="280"/>
       </w:pPr>
     </w:lvl>
     <w:lvl w:ilvl="2">
       <w:start w:val="1"/>
       <w:numFmt w:val="bullet"/>
       <w:lvlText w:val="▪"/>
-      <w:rPr>
-        <w:rFonts w:ascii="Symbol" w:hAnsi="Symbol"/>
-      </w:rPr>
-      <w:lvlJc w:val="left"/>
-      <w:pPr>
-        <w:tabs/>
-        <w:ind w:left="1440" w:hanging="360"/>
+      <w:lvlJc w:val="left"/>
+      <w:pPr>
+        <w:tabs>
+          <w:tab w:val="num" w:pos="840"/>
+        </w:tabs>
+        <w:ind w:left="840" w:hanging="280"/>
       </w:pPr>
     </w:lvl>
     <w:lvl w:ilvl="3">
       <w:start w:val="1"/>
       <w:numFmt w:val="bullet"/>
       <w:lvlText w:val="•"/>
-      <w:rPr>
-        <w:rFonts w:ascii="Symbol" w:hAnsi="Symbol"/>
-      </w:rPr>
-      <w:lvlJc w:val="left"/>
-      <w:pPr>
-        <w:tabs/>
-        <w:ind w:left="1800" w:hanging="360"/>
+      <w:lvlJc w:val="left"/>
+      <w:pPr>
+        <w:tabs>
+          <w:tab w:val="num" w:pos="1120"/>
+        </w:tabs>
+        <w:ind w:left="1120" w:hanging="280"/>
       </w:pPr>
     </w:lvl>
     <w:lvl w:ilvl="4">
       <w:start w:val="1"/>
       <w:numFmt w:val="bullet"/>
       <w:lvlText w:val="◦"/>
-      <w:rPr>
-        <w:rFonts w:ascii="Symbol" w:hAnsi="Symbol"/>
-      </w:rPr>
-      <w:lvlJc w:val="left"/>
-      <w:pPr>
-        <w:tabs/>
-        <w:ind w:left="2160" w:hanging="360"/>
+      <w:lvlJc w:val="left"/>
+      <w:pPr>
+        <w:tabs>
+          <w:tab w:val="num" w:pos="1400"/>
+        </w:tabs>
+        <w:ind w:left="1400" w:hanging="280"/>
       </w:pPr>
     </w:lvl>
     <w:lvl w:ilvl="5">
       <w:start w:val="1"/>
       <w:numFmt w:val="bullet"/>
       <w:lvlText w:val="▪"/>
-      <w:rPr>
-        <w:rFonts w:ascii="Symbol" w:hAnsi="Symbol"/>
-      </w:rPr>
-      <w:lvlJc w:val="left"/>
-      <w:pPr>
-        <w:tabs/>
-        <w:ind w:left="2520" w:hanging="360"/>
+      <w:lvlJc w:val="left"/>
+      <w:pPr>
+        <w:tabs>
+          <w:tab w:val="num" w:pos="1680"/>
+        </w:tabs>
+        <w:ind w:left="1680" w:hanging="280"/>
       </w:pPr>
     </w:lvl>
     <w:lvl w:ilvl="6">
       <w:start w:val="1"/>
       <w:numFmt w:val="bullet"/>
       <w:lvlText w:val="•"/>
-      <w:rPr>
-        <w:rFonts w:ascii="Symbol" w:hAnsi="Symbol"/>
-      </w:rPr>
-      <w:lvlJc w:val="left"/>
-      <w:pPr>
-        <w:tabs/>
-        <w:ind w:left="2880" w:hanging="360"/>
+      <w:lvlJc w:val="left"/>
+      <w:pPr>
+        <w:tabs>
+          <w:tab w:val="num" w:pos="1960"/>
+        </w:tabs>
+        <w:ind w:left="1960" w:hanging="280"/>
       </w:pPr>
     </w:lvl>
     <w:lvl w:ilvl="7">
       <w:start w:val="1"/>
       <w:numFmt w:val="bullet"/>
       <w:lvlText w:val="◦"/>
-      <w:rPr>
-        <w:rFonts w:ascii="Symbol" w:hAnsi="Symbol"/>
-      </w:rPr>
-      <w:lvlJc w:val="left"/>
-      <w:pPr>
-        <w:tabs/>
-        <w:ind w:left="3240" w:hanging="360"/>
+      <w:lvlJc w:val="left"/>
+      <w:pPr>
+        <w:tabs>
+          <w:tab w:val="num" w:pos="2240"/>
+        </w:tabs>
+        <w:ind w:left="2240" w:hanging="280"/>
       </w:pPr>
     </w:lvl>
     <w:lvl w:ilvl="8">
       <w:start w:val="1"/>
       <w:numFmt w:val="bullet"/>
       <w:lvlText w:val="▪"/>
-      <w:rPr>
-        <w:rFonts w:ascii="Symbol" w:hAnsi="Symbol"/>
-      </w:rPr>
-      <w:lvlJc w:val="left"/>
-      <w:pPr>
-        <w:tabs/>
-        <w:ind w:left="3600" w:hanging="360"/>
+      <w:lvlJc w:val="left"/>
+      <w:pPr>
+        <w:tabs>
+          <w:tab w:val="num" w:pos="2520"/>
+        </w:tabs>
+        <w:ind w:left="2520" w:hanging="280"/>
       </w:pPr>
     </w:lvl>
   </w:abstractNum>
@@ -1104,8 +1168,10 @@
       <w:lvlText w:val="%1."/>
       <w:lvlJc w:val="left"/>
       <w:pPr>
-        <w:tabs/>
-        <w:ind w:left="720" w:hanging="360"/>
+        <w:tabs>
+          <w:tab w:val="num" w:pos="280"/>
+        </w:tabs>
+        <w:ind w:left="280" w:hanging="280"/>
       </w:pPr>
     </w:lvl>
     <w:lvl w:ilvl="1">
@@ -1114,8 +1180,10 @@
       <w:lvlText w:val="%2."/>
       <w:lvlJc w:val="left"/>
       <w:pPr>
-        <w:tabs/>
-        <w:ind w:left="1080" w:hanging="360"/>
+        <w:tabs>
+          <w:tab w:val="num" w:pos="560"/>
+        </w:tabs>
+        <w:ind w:left="560" w:hanging="280"/>
       </w:pPr>
     </w:lvl>
     <w:lvl w:ilvl="2">
@@ -1124,8 +1192,10 @@
       <w:lvlText w:val="%3."/>
       <w:lvlJc w:val="left"/>
       <w:pPr>
-        <w:tabs/>
-        <w:ind w:left="1440" w:hanging="360"/>
+        <w:tabs>
+          <w:tab w:val="num" w:pos="840"/>
+        </w:tabs>
+        <w:ind w:left="840" w:hanging="280"/>
       </w:pPr>
     </w:lvl>
     <w:lvl w:ilvl="3">
@@ -1134,8 +1204,10 @@
       <w:lvlText w:val="%4."/>
       <w:lvlJc w:val="left"/>
       <w:pPr>
-        <w:tabs/>
-        <w:ind w:left="1800" w:hanging="360"/>
+        <w:tabs>
+          <w:tab w:val="num" w:pos="1120"/>
+        </w:tabs>
+        <w:ind w:left="1120" w:hanging="280"/>
       </w:pPr>
     </w:lvl>
     <w:lvl w:ilvl="4">
@@ -1144,8 +1216,10 @@
       <w:lvlText w:val="%5."/>
       <w:lvlJc w:val="left"/>
       <w:pPr>
-        <w:tabs/>
-        <w:ind w:left="2160" w:hanging="360"/>
+        <w:tabs>
+          <w:tab w:val="num" w:pos="1400"/>
+        </w:tabs>
+        <w:ind w:left="1400" w:hanging="280"/>
       </w:pPr>
     </w:lvl>
     <w:lvl w:ilvl="5">
@@ -1154,8 +1228,10 @@
       <w:lvlText w:val="%6."/>
       <w:lvlJc w:val="left"/>
       <w:pPr>
-        <w:tabs/>
-        <w:ind w:left="2520" w:hanging="360"/>
+        <w:tabs>
+          <w:tab w:val="num" w:pos="1680"/>
+        </w:tabs>
+        <w:ind w:left="1680" w:hanging="280"/>
       </w:pPr>
     </w:lvl>
     <w:lvl w:ilvl="6">
@@ -1164,8 +1240,10 @@
       <w:lvlText w:val="%7."/>
       <w:lvlJc w:val="left"/>
       <w:pPr>
-        <w:tabs/>
-        <w:ind w:left="2880" w:hanging="360"/>
+        <w:tabs>
+          <w:tab w:val="num" w:pos="1960"/>
+        </w:tabs>
+        <w:ind w:left="1960" w:hanging="280"/>
       </w:pPr>
     </w:lvl>
     <w:lvl w:ilvl="7">
@@ -1174,8 +1252,10 @@
       <w:lvlText w:val="%8."/>
       <w:lvlJc w:val="left"/>
       <w:pPr>
-        <w:tabs/>
-        <w:ind w:left="3240" w:hanging="360"/>
+        <w:tabs>
+          <w:tab w:val="num" w:pos="2240"/>
+        </w:tabs>
+        <w:ind w:left="2240" w:hanging="280"/>
       </w:pPr>
     </w:lvl>
     <w:lvl w:ilvl="8">
@@ -1184,13 +1264,18 @@
       <w:lvlText w:val="%9."/>
       <w:lvlJc w:val="left"/>
       <w:pPr>
-        <w:tabs/>
-        <w:ind w:left="3600" w:hanging="360"/>
+        <w:tabs>
+          <w:tab w:val="num" w:pos="2520"/>
+        </w:tabs>
+        <w:ind w:left="2520" w:hanging="280"/>
       </w:pPr>
     </w:lvl>
   </w:abstractNum>
   <w:num w:numId="3">
     <w:abstractNumId w:val="2"/>
+    <w:lvlOverride w:ilvl="0">
+      <w:startOverride w:val="1"/>
+    </w:lvlOverride>
   </w:num>
 </w:numbering>
 </file>
@@ -1200,21 +1285,27 @@
   <w:docDefaults>
     <w:rPrDefault>
       <w:rPr>
-        <w:rFonts w:asciiTheme="minorHAnsi" w:hAnsiTheme="minorHAnsi" w:eastAsiaTheme="minorEastAsia" w:cstheme="minorBidi"/>
+        <w:rFonts w:ascii="Libertinus Serif" w:hAnsi="Libertinus Serif" w:asciiTheme="minorHAnsi" w:hAnsiTheme="minorHAnsi" w:eastAsiaTheme="minorEastAsia" w:cstheme="minorBidi"/>
+        <w:color w:val="000000"/>
         <w:sz w:val="22"/>
         <w:szCs w:val="22"/>
       </w:rPr>
     </w:rPrDefault>
     <w:pPrDefault>
       <w:pPr>
-        <w:spacing w:after="160" w:line="259" w:lineRule="auto"/>
+        <w:spacing w:after="120" w:line="288" w:lineRule="exact"/>
       </w:pPr>
     </w:pPrDefault>
   </w:docDefaults>
   <w:style w:type="paragraph" w:styleId="Normal" w:default="1">
     <w:name w:val="Normal"/>
     <w:qFormat/>
+    <w:pPr>
+      <w:spacing w:after="120" w:line="288" w:lineRule="exact"/>
+    </w:pPr>
     <w:rPr>
+      <w:rFonts w:ascii="Libertinus Serif" w:hAnsi="Libertinus Serif"/>
+      <w:color w:val="000000"/>
       <w:sz w:val="22"/>
       <w:szCs w:val="22"/>
     </w:rPr>
@@ -1224,14 +1315,16 @@
     <w:basedOn w:val="Normal"/>
     <w:qFormat/>
     <w:pPr>
-      <w:spacing w:after="240"/>
+      <w:keepNext w:val="1"/>
+      <w:spacing w:before="421" w:after="281" w:line="489" w:lineRule="exact"/>
       <w:outlineLvl w:val="0"/>
     </w:pPr>
     <w:rPr>
+      <w:rFonts w:ascii="Libertinus Serif" w:hAnsi="Libertinus Serif"/>
       <w:b w:val="1"/>
-      <w:sz w:val="52"/>
-      <w:szCs w:val="52"/>
-      <w:color w:val="1F1F1F"/>
+      <w:color w:val="000000"/>
+      <w:sz w:val="37"/>
+      <w:szCs w:val="37"/>
     </w:rPr>
   </w:style>
   <w:style w:type="paragraph" w:styleId="Subtitle" w:default="0">
@@ -1239,13 +1332,14 @@
     <w:basedOn w:val="Normal"/>
     <w:qFormat/>
     <w:pPr>
-      <w:spacing w:after="200"/>
+      <w:spacing w:after="120" w:line="288" w:lineRule="exact"/>
     </w:pPr>
     <w:rPr>
+      <w:rFonts w:ascii="Libertinus Serif" w:hAnsi="Libertinus Serif"/>
       <w:i w:val="1"/>
-      <w:sz w:val="30"/>
-      <w:szCs w:val="30"/>
-      <w:color w:val="595959"/>
+      <w:color w:val="000000"/>
+      <w:sz w:val="22"/>
+      <w:szCs w:val="22"/>
     </w:rPr>
   </w:style>
   <w:style w:type="paragraph" w:styleId="Quote" w:default="0">
@@ -1253,26 +1347,21 @@
     <w:basedOn w:val="Normal"/>
     <w:qFormat/>
     <w:pPr>
-      <w:ind w:left="720" w:right="720"/>
-      <w:spacing w:before="120" w:after="120"/>
+      <w:ind w:left="220" w:right="220"/>
     </w:pPr>
-    <w:rPr>
-      <w:i w:val="1"/>
-      <w:color w:val="404040"/>
-    </w:rPr>
   </w:style>
   <w:style w:type="paragraph" w:styleId="Caption" w:default="0">
     <w:name w:val="Caption"/>
     <w:basedOn w:val="Normal"/>
     <w:qFormat/>
     <w:pPr>
-      <w:spacing w:before="120" w:after="120"/>
+      <w:spacing w:before="143" w:after="120" w:line="288" w:lineRule="exact"/>
     </w:pPr>
     <w:rPr>
-      <w:i w:val="1"/>
-      <w:sz w:val="18"/>
-      <w:szCs w:val="18"/>
-      <w:color w:val="404040"/>
+      <w:rFonts w:ascii="Libertinus Serif" w:hAnsi="Libertinus Serif"/>
+      <w:color w:val="000000"/>
+      <w:sz w:val="22"/>
+      <w:szCs w:val="22"/>
     </w:rPr>
   </w:style>
   <w:style w:type="paragraph" w:styleId="Code" w:default="0">
@@ -1280,12 +1369,11 @@
     <w:basedOn w:val="Normal"/>
     <w:qFormat/>
     <w:pPr>
-      <w:ind w:left="360" w:right="360"/>
-      <w:spacing w:before="120" w:after="120"/>
-      <w:shd w:val="clear" w:color="auto" w:fill="F2F2F2"/>
+      <w:spacing w:after="120" w:line="242" w:lineRule="exact"/>
     </w:pPr>
     <w:rPr>
-      <w:rFonts w:ascii="Courier New" w:hAnsi="Courier New"/>
+      <w:rFonts w:ascii="DejaVu Sans Mono" w:hAnsi="DejaVu Sans Mono"/>
+      <w:color w:val="000000"/>
       <w:sz w:val="18"/>
       <w:szCs w:val="18"/>
     </w:rPr>
@@ -1294,31 +1382,25 @@
     <w:name w:val="List Paragraph"/>
     <w:basedOn w:val="Normal"/>
     <w:qFormat/>
-    <w:pPr>
-      <w:ind w:left="720"/>
-    </w:pPr>
   </w:style>
   <w:style w:type="character" w:styleId="Hyperlink" w:default="0">
     <w:name w:val="Hyperlink"/>
-    <w:rPr>
-      <w:u w:val="single"/>
-      <w:color w:val="0563C1"/>
-    </w:rPr>
   </w:style>
   <w:style w:type="paragraph" w:styleId="Heading1" w:default="0">
     <w:name w:val="heading 1"/>
     <w:basedOn w:val="Normal"/>
     <w:qFormat/>
     <w:pPr>
-      <w:spacing w:before="200" w:after="80"/>
       <w:keepNext w:val="1"/>
+      <w:spacing w:before="396" w:after="165" w:line="403" w:lineRule="exact"/>
       <w:outlineLvl w:val="0"/>
     </w:pPr>
     <w:rPr>
+      <w:rFonts w:ascii="Libertinus Serif" w:hAnsi="Libertinus Serif"/>
       <w:b w:val="1"/>
-      <w:sz w:val="40"/>
-      <w:szCs w:val="40"/>
-      <w:color w:val="2F5496"/>
+      <w:color w:val="000000"/>
+      <w:sz w:val="31"/>
+      <w:szCs w:val="31"/>
     </w:rPr>
   </w:style>
   <w:style w:type="paragraph" w:styleId="Heading2" w:default="0">
@@ -1326,15 +1408,16 @@
     <w:basedOn w:val="Normal"/>
     <w:qFormat/>
     <w:pPr>
-      <w:spacing w:before="120" w:after="80"/>
       <w:keepNext w:val="1"/>
+      <w:spacing w:before="317" w:after="165" w:line="346" w:lineRule="exact"/>
       <w:outlineLvl w:val="1"/>
     </w:pPr>
     <w:rPr>
+      <w:rFonts w:ascii="Libertinus Serif" w:hAnsi="Libertinus Serif"/>
       <w:b w:val="1"/>
-      <w:sz w:val="38"/>
-      <w:szCs w:val="38"/>
-      <w:color w:val="2F5496"/>
+      <w:color w:val="000000"/>
+      <w:sz w:val="26"/>
+      <w:szCs w:val="26"/>
     </w:rPr>
   </w:style>
   <w:style w:type="paragraph" w:styleId="Heading3" w:default="0">
@@ -1342,15 +1425,16 @@
     <w:basedOn w:val="Normal"/>
     <w:qFormat/>
     <w:pPr>
-      <w:spacing w:before="120" w:after="80"/>
       <w:keepNext w:val="1"/>
+      <w:spacing w:before="317" w:after="165" w:line="288" w:lineRule="exact"/>
       <w:outlineLvl w:val="2"/>
     </w:pPr>
     <w:rPr>
+      <w:rFonts w:ascii="Libertinus Serif" w:hAnsi="Libertinus Serif"/>
       <w:b w:val="1"/>
-      <w:sz w:val="35"/>
-      <w:szCs w:val="35"/>
-      <w:color w:val="2F5496"/>
+      <w:color w:val="000000"/>
+      <w:sz w:val="22"/>
+      <w:szCs w:val="22"/>
     </w:rPr>
   </w:style>
   <w:style w:type="paragraph" w:styleId="Heading4" w:default="0">
@@ -1358,15 +1442,16 @@
     <w:basedOn w:val="Normal"/>
     <w:qFormat/>
     <w:pPr>
-      <w:spacing w:before="120" w:after="80"/>
       <w:keepNext w:val="1"/>
+      <w:spacing w:before="317" w:after="165" w:line="288" w:lineRule="exact"/>
       <w:outlineLvl w:val="3"/>
     </w:pPr>
     <w:rPr>
+      <w:rFonts w:ascii="Libertinus Serif" w:hAnsi="Libertinus Serif"/>
       <w:b w:val="1"/>
-      <w:sz w:val="32"/>
-      <w:szCs w:val="32"/>
-      <w:color w:val="2F5496"/>
+      <w:color w:val="000000"/>
+      <w:sz w:val="22"/>
+      <w:szCs w:val="22"/>
     </w:rPr>
   </w:style>
   <w:style w:type="paragraph" w:styleId="Heading5" w:default="0">
@@ -1374,15 +1459,16 @@
     <w:basedOn w:val="Normal"/>
     <w:qFormat/>
     <w:pPr>
-      <w:spacing w:before="120" w:after="80"/>
       <w:keepNext w:val="1"/>
+      <w:spacing w:before="317" w:after="165" w:line="288" w:lineRule="exact"/>
       <w:outlineLvl w:val="4"/>
     </w:pPr>
     <w:rPr>
+      <w:rFonts w:ascii="Libertinus Serif" w:hAnsi="Libertinus Serif"/>
       <w:b w:val="1"/>
-      <w:sz w:val="30"/>
-      <w:szCs w:val="30"/>
-      <w:color w:val="2F5496"/>
+      <w:color w:val="000000"/>
+      <w:sz w:val="22"/>
+      <w:szCs w:val="22"/>
     </w:rPr>
   </w:style>
   <w:style w:type="paragraph" w:styleId="Heading6" w:default="0">
@@ -1390,15 +1476,16 @@
     <w:basedOn w:val="Normal"/>
     <w:qFormat/>
     <w:pPr>
-      <w:spacing w:before="120" w:after="80"/>
       <w:keepNext w:val="1"/>
+      <w:spacing w:before="317" w:after="165" w:line="288" w:lineRule="exact"/>
       <w:outlineLvl w:val="5"/>
     </w:pPr>
     <w:rPr>
+      <w:rFonts w:ascii="Libertinus Serif" w:hAnsi="Libertinus Serif"/>
       <w:b w:val="1"/>
-      <w:sz w:val="28"/>
-      <w:szCs w:val="28"/>
-      <w:color w:val="2F5496"/>
+      <w:color w:val="000000"/>
+      <w:sz w:val="22"/>
+      <w:szCs w:val="22"/>
     </w:rPr>
   </w:style>
   <w:style w:type="paragraph" w:styleId="Heading7" w:default="0">
@@ -1406,15 +1493,16 @@
     <w:basedOn w:val="Normal"/>
     <w:qFormat/>
     <w:pPr>
-      <w:spacing w:before="120" w:after="80"/>
       <w:keepNext w:val="1"/>
+      <w:spacing w:before="317" w:after="165" w:line="288" w:lineRule="exact"/>
       <w:outlineLvl w:val="6"/>
     </w:pPr>
     <w:rPr>
+      <w:rFonts w:ascii="Libertinus Serif" w:hAnsi="Libertinus Serif"/>
       <w:b w:val="1"/>
-      <w:sz w:val="25"/>
-      <w:szCs w:val="25"/>
-      <w:color w:val="2F5496"/>
+      <w:color w:val="000000"/>
+      <w:sz w:val="22"/>
+      <w:szCs w:val="22"/>
     </w:rPr>
   </w:style>
   <w:style w:type="paragraph" w:styleId="Heading8" w:default="0">
@@ -1422,15 +1510,16 @@
     <w:basedOn w:val="Normal"/>
     <w:qFormat/>
     <w:pPr>
-      <w:spacing w:before="120" w:after="80"/>
       <w:keepNext w:val="1"/>
+      <w:spacing w:before="317" w:after="165" w:line="288" w:lineRule="exact"/>
       <w:outlineLvl w:val="7"/>
     </w:pPr>
     <w:rPr>
+      <w:rFonts w:ascii="Libertinus Serif" w:hAnsi="Libertinus Serif"/>
       <w:b w:val="1"/>
+      <w:color w:val="000000"/>
       <w:sz w:val="22"/>
       <w:szCs w:val="22"/>
-      <w:color w:val="2F5496"/>
     </w:rPr>
   </w:style>
   <w:style w:type="paragraph" w:styleId="Heading9" w:default="0">
@@ -1438,24 +1527,25 @@
     <w:basedOn w:val="Normal"/>
     <w:qFormat/>
     <w:pPr>
-      <w:spacing w:before="120" w:after="80"/>
       <w:keepNext w:val="1"/>
+      <w:spacing w:before="317" w:after="165" w:line="288" w:lineRule="exact"/>
       <w:outlineLvl w:val="8"/>
     </w:pPr>
     <w:rPr>
+      <w:rFonts w:ascii="Libertinus Serif" w:hAnsi="Libertinus Serif"/>
       <w:b w:val="1"/>
+      <w:color w:val="000000"/>
       <w:sz w:val="22"/>
       <w:szCs w:val="22"/>
-      <w:color w:val="2F5496"/>
     </w:rPr>
   </w:style>
 </w:styles>
 </file>
 
 <file path=word/theme/theme1.xml><?xml version="1.0" encoding="utf-8"?>
-<a:theme xmlns:a="http://schemas.openxmlformats.org/drawingml/2006/main" name="typx">
+<a:theme xmlns:a="http://schemas.openxmlformats.org/drawingml/2006/main" name="typx Typst">
   <a:themeElements>
-    <a:clrScheme name="typx">
+    <a:clrScheme name="typx Typst">
       <a:dk1>
         <a:sysClr val="windowText" lastClr="000000"/>
       </a:dk1>
@@ -1487,29 +1577,78 @@
         <a:srgbClr val="70AD47"/>
       </a:accent6>
       <a:hlink>
-        <a:srgbClr val="0563C1"/>
+        <a:srgbClr val="000000"/>
       </a:hlink>
       <a:folHlink>
-        <a:srgbClr val="954F72"/>
+        <a:srgbClr val="000000"/>
       </a:folHlink>
     </a:clrScheme>
-    <a:fontScheme name="typx">
+    <a:fontScheme name="typx Typst">
       <a:majorFont>
-        <a:latin typeface="Aptos Display"/>
+        <a:latin typeface="Libertinus Serif"/>
         <a:ea typeface=""/>
         <a:cs typeface=""/>
       </a:majorFont>
       <a:minorFont>
-        <a:latin typeface="Aptos"/>
+        <a:latin typeface="Libertinus Serif"/>
         <a:ea typeface=""/>
         <a:cs typeface=""/>
       </a:minorFont>
     </a:fontScheme>
-    <a:fmtScheme name="typx">
-      <a:fillStyleLst/>
-      <a:lnStyleLst/>
-      <a:effectStyleLst/>
-      <a:bgFillStyleLst/>
+    <a:fmtScheme name="typx Typst">
+      <a:fillStyleLst>
+        <a:solidFill>
+          <a:schemeClr val="phClr"/>
+        </a:solidFill>
+        <a:solidFill>
+          <a:schemeClr val="phClr"/>
+        </a:solidFill>
+        <a:solidFill>
+          <a:schemeClr val="phClr"/>
+        </a:solidFill>
+      </a:fillStyleLst>
+      <a:lnStyleLst>
+        <a:ln w="9525" cap="flat" cmpd="sng" algn="ctr">
+          <a:solidFill>
+            <a:schemeClr val="phClr"/>
+          </a:solidFill>
+          <a:prstDash val="solid"/>
+        </a:ln>
+        <a:ln w="25400" cap="flat" cmpd="sng" algn="ctr">
+          <a:solidFill>
+            <a:schemeClr val="phClr"/>
+          </a:solidFill>
+          <a:prstDash val="solid"/>
+        </a:ln>
+        <a:ln w="38100" cap="flat" cmpd="sng" algn="ctr">
+          <a:solidFill>
+            <a:schemeClr val="phClr"/>
+          </a:solidFill>
+          <a:prstDash val="solid"/>
+        </a:ln>
+      </a:lnStyleLst>
+      <a:effectStyleLst>
+        <a:effectStyle>
+          <a:effectLst/>
+        </a:effectStyle>
+        <a:effectStyle>
+          <a:effectLst/>
+        </a:effectStyle>
+        <a:effectStyle>
+          <a:effectLst/>
+        </a:effectStyle>
+      </a:effectStyleLst>
+      <a:bgFillStyleLst>
+        <a:solidFill>
+          <a:schemeClr val="phClr"/>
+        </a:solidFill>
+        <a:solidFill>
+          <a:schemeClr val="phClr"/>
+        </a:solidFill>
+        <a:solidFill>
+          <a:schemeClr val="phClr"/>
+        </a:solidFill>
+      </a:bgFillStyleLst>
     </a:fmtScheme>
   </a:themeElements>
   <a:objectDefaults/>
@@ -1518,8 +1657,8 @@
 </file>
 
 <file path=customXml/typx-source.xml><?xml version="1.0" encoding="utf-8"?>
-<typx:roundtrip xmlns:typx="urn:typx:roundtrip:1" format="1" source-format="typst" source-sha256="be87df4fa418c83de9383fe798f2df7b8ccb6528a0d6edfd2d189c16c89c30b7" document-semantic-sha256="9c4c618211bab14733f33a916d17550b92c9da59d5f0a6b7330e6456b3cb5fe8" encoding="gzip+base64" source-path="/mnt/data/typx/examples/demo.typ">
-  <typx:source>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</typx:source>
+<typx:roundtrip xmlns:typx="urn:typx:roundtrip:1" format="1" source-format="typst" source-sha256="09034d3a6b13c4a3441909cf0f7ad84f56f70f2f7260d5ca0b490fbdf1e6c774" document-semantic-sha256="f4e791b11fed4cdc96023d93ce1fd303797f9a306fe2d8319f04a7dc6c6e9125" encoding="gzip+base64" source-path="/mnt/data/typx_work/typx-0.3.0/examples/demo.typ">
+  <typx:source>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</typx:source>
   <typx:metadata>
     <typx:item name="model">shared-ir-v1</typx:item>
     <typx:item name="writer">typx</typx:item>

</xml_diff>